<commit_message>
Updates Algorithm deconstruction challenge document
Reflection question scompleted
</commit_message>
<xml_diff>
--- a/use-cases/code-algorithms/java/TaskManager/Algorthm Deconstruction challenged.docx
+++ b/use-cases/code-algorithms/java/TaskManager/Algorthm Deconstruction challenged.docx
@@ -316,86 +316,227 @@
       </w:r>
       <w:proofErr w:type="spellEnd"/>
       <w:r>
-        <w:t xml:space="preserve"> is </w:t>
+        <w:t xml:space="preserve"> is a data structure that stores key and value pairs, you can use a key to look up the value it is connected to.</w:t>
+      </w:r>
+      <w:r>
+        <w:t xml:space="preserve"> If the priority does not match any key, it returns a zero instead of throwing a </w:t>
       </w:r>
       <w:proofErr w:type="spellStart"/>
       <w:r>
-        <w:t>a</w:t>
+        <w:t>nullpointerexception</w:t>
       </w:r>
       <w:proofErr w:type="spellEnd"/>
       <w:r>
-        <w:t xml:space="preserve"> data structure that stores key and value pairs, you can use a key to look up the value it is connected to.</w:t>
-      </w:r>
-      <w:r>
-        <w:t xml:space="preserve"> If the priority does not match any key, it returns a zero instead of throwing a </w:t>
+        <w:t xml:space="preserve">. </w:t>
+      </w:r>
+    </w:p>
+    <w:p>
+      <w:pPr>
+        <w:pStyle w:val="Heading2"/>
+      </w:pPr>
+      <w:r>
+        <w:t>Due date factor:</w:t>
+      </w:r>
+    </w:p>
+    <w:p>
+      <w:r>
+        <w:t xml:space="preserve">Converts the due date into days remaining. A negative result means the task is overdue. The close the deadline, the higher the score that gets added. </w:t>
+      </w:r>
+    </w:p>
+    <w:p>
+      <w:pPr>
+        <w:pStyle w:val="Heading2"/>
+      </w:pPr>
+      <w:r>
+        <w:t>Status penalty:</w:t>
+      </w:r>
+    </w:p>
+    <w:p>
+      <w:r>
+        <w:t>Completed tasks get their score reduced a lot to take them to the bottom of the list. Taks in their ‘Review’ status get a smaller reduction in score.</w:t>
+      </w:r>
+    </w:p>
+    <w:p>
+      <w:pPr>
+        <w:pStyle w:val="Heading2"/>
+      </w:pPr>
+      <w:r>
+        <w:t>Tag boost:</w:t>
+      </w:r>
+    </w:p>
+    <w:p>
+      <w:r>
+        <w:t>Uses a stream to check if the tags match certain keywords. If they match one tag they earn a small score.</w:t>
+      </w:r>
+    </w:p>
+    <w:p>
+      <w:pPr>
+        <w:pStyle w:val="Heading2"/>
+      </w:pPr>
+      <w:r>
+        <w:t>Recency Boost:</w:t>
+      </w:r>
+    </w:p>
+    <w:p>
+      <w:r>
+        <w:t xml:space="preserve">Tasks that were updated recently get a small score boost. </w:t>
+      </w:r>
+    </w:p>
+    <w:p>
+      <w:pPr>
+        <w:pStyle w:val="Heading1"/>
+      </w:pPr>
+      <w:r>
+        <w:t>Reflection:</w:t>
+      </w:r>
+    </w:p>
+    <w:p>
+      <w:pPr>
+        <w:pStyle w:val="NormalWeb"/>
+        <w:numPr>
+          <w:ilvl w:val="0"/>
+          <w:numId w:val="3"/>
+        </w:numPr>
+        <w:shd w:val="clear" w:color="auto" w:fill="FFFFFF"/>
+        <w:spacing w:before="0" w:beforeAutospacing="0" w:after="0" w:afterAutospacing="0"/>
+        <w:rPr>
+          <w:rFonts w:asciiTheme="minorHAnsi" w:hAnsiTheme="minorHAnsi"/>
+          <w:b/>
+          <w:bCs/>
+          <w:color w:val="333333"/>
+        </w:rPr>
+      </w:pPr>
+      <w:r>
+        <w:rPr>
+          <w:rFonts w:asciiTheme="minorHAnsi" w:hAnsiTheme="minorHAnsi"/>
+          <w:b/>
+          <w:bCs/>
+          <w:color w:val="333333"/>
+        </w:rPr>
+        <w:t>How did the AI’s explanation change your understanding of the algorithm?</w:t>
+      </w:r>
+    </w:p>
+    <w:p>
+      <w:pPr>
+        <w:pStyle w:val="ListParagraph"/>
+      </w:pPr>
+      <w:r>
+        <w:t>I understood most of the algorithm, but I did not understand what hash maps are, as well as how and why they are used in the algorithm. The AI did help me understand that a HashMap is a data structure that stores key and value pairs. It maps an enumeration value to a numeric weight. If the priority does not match a key, it returns 0 instead of a null pointer exception.</w:t>
+      </w:r>
+    </w:p>
+    <w:p>
+      <w:pPr>
+        <w:pStyle w:val="NormalWeb"/>
+        <w:numPr>
+          <w:ilvl w:val="0"/>
+          <w:numId w:val="5"/>
+        </w:numPr>
+        <w:shd w:val="clear" w:color="auto" w:fill="FFFFFF"/>
+        <w:spacing w:before="0" w:beforeAutospacing="0" w:after="0" w:afterAutospacing="0"/>
+        <w:rPr>
+          <w:rFonts w:asciiTheme="minorHAnsi" w:hAnsiTheme="minorHAnsi"/>
+          <w:b/>
+          <w:bCs/>
+          <w:color w:val="333333"/>
+        </w:rPr>
+      </w:pPr>
+      <w:r>
+        <w:rPr>
+          <w:rFonts w:asciiTheme="minorHAnsi" w:hAnsiTheme="minorHAnsi"/>
+          <w:b/>
+          <w:bCs/>
+          <w:color w:val="333333"/>
+        </w:rPr>
+        <w:t>What aspects were still difficult to understand after AI explanation?</w:t>
+      </w:r>
+    </w:p>
+    <w:p>
+      <w:pPr>
+        <w:pStyle w:val="ListParagraph"/>
+      </w:pPr>
+      <w:r>
+        <w:t>None</w:t>
+      </w:r>
+    </w:p>
+    <w:p>
+      <w:pPr>
+        <w:pStyle w:val="ListParagraph"/>
+        <w:numPr>
+          <w:ilvl w:val="0"/>
+          <w:numId w:val="6"/>
+        </w:numPr>
+        <w:rPr>
+          <w:b/>
+          <w:bCs/>
+          <w:sz w:val="24"/>
+          <w:szCs w:val="24"/>
+        </w:rPr>
+      </w:pPr>
+      <w:r>
+        <w:rPr>
+          <w:b/>
+          <w:bCs/>
+          <w:color w:val="333333"/>
+          <w:sz w:val="24"/>
+          <w:szCs w:val="24"/>
+          <w:shd w:val="clear" w:color="auto" w:fill="FFFFFF"/>
+        </w:rPr>
+        <w:t>How would you explain this algorithm to another junior developer?</w:t>
+      </w:r>
+    </w:p>
+    <w:p>
+      <w:pPr>
+        <w:ind w:left="720"/>
+      </w:pPr>
+      <w:r>
+        <w:t>The algorithm uses a task’s attributes to build a score value that is used to rank the task’s priority with other tasks.</w:t>
+      </w:r>
+    </w:p>
+    <w:p>
+      <w:pPr>
+        <w:ind w:left="720"/>
+      </w:pPr>
+    </w:p>
+    <w:p>
+      <w:pPr>
+        <w:pStyle w:val="NormalWeb"/>
+        <w:numPr>
+          <w:ilvl w:val="0"/>
+          <w:numId w:val="10"/>
+        </w:numPr>
+        <w:shd w:val="clear" w:color="auto" w:fill="FFFFFF"/>
+        <w:spacing w:before="0" w:beforeAutospacing="0" w:after="0" w:afterAutospacing="0"/>
+        <w:rPr>
+          <w:rFonts w:asciiTheme="minorHAnsi" w:hAnsiTheme="minorHAnsi"/>
+          <w:b/>
+          <w:bCs/>
+          <w:color w:val="333333"/>
+        </w:rPr>
+      </w:pPr>
+      <w:r>
+        <w:rPr>
+          <w:rFonts w:asciiTheme="minorHAnsi" w:hAnsiTheme="minorHAnsi"/>
+          <w:b/>
+          <w:bCs/>
+          <w:color w:val="333333"/>
+        </w:rPr>
+        <w:t>Did you test this understanding against AI?</w:t>
+      </w:r>
+    </w:p>
+    <w:p>
+      <w:pPr>
+        <w:ind w:left="1080"/>
+      </w:pPr>
+      <w:r>
+        <w:t xml:space="preserve">Yes. The AI generated random task attributes and </w:t>
       </w:r>
       <w:proofErr w:type="spellStart"/>
       <w:r>
-        <w:t>nullpointerexception</w:t>
+        <w:t>i</w:t>
       </w:r>
       <w:proofErr w:type="spellEnd"/>
       <w:r>
-        <w:t xml:space="preserve">. </w:t>
-      </w:r>
-    </w:p>
-    <w:p>
-      <w:pPr>
-        <w:pStyle w:val="Heading2"/>
-      </w:pPr>
-      <w:r>
-        <w:t>Due date factor:</w:t>
-      </w:r>
-    </w:p>
-    <w:p>
-      <w:r>
-        <w:t xml:space="preserve">Converts the due date into days remaining. A negative result means the task is overdue. The close the deadline, the higher the score that gets added. </w:t>
-      </w:r>
-    </w:p>
-    <w:p>
-      <w:pPr>
-        <w:pStyle w:val="Heading2"/>
-      </w:pPr>
-      <w:r>
-        <w:t>Status penalty:</w:t>
-      </w:r>
-    </w:p>
-    <w:p>
-      <w:r>
-        <w:t>Completed tasks get their score reduced a lot to take them to the bottom of the list. Taks in their ‘Review’ status get a smaller reduction in score.</w:t>
-      </w:r>
-    </w:p>
-    <w:p>
-      <w:pPr>
-        <w:pStyle w:val="Heading2"/>
-      </w:pPr>
-      <w:r>
-        <w:t>Tag boost:</w:t>
-      </w:r>
-    </w:p>
-    <w:p>
-      <w:r>
-        <w:t>Uses a stream to check if the tags match certain keywords. If they match one tag they earn a small score.</w:t>
-      </w:r>
-    </w:p>
-    <w:p>
-      <w:pPr>
-        <w:pStyle w:val="Heading2"/>
-      </w:pPr>
-      <w:r>
-        <w:t>Recency Boost:</w:t>
-      </w:r>
-    </w:p>
-    <w:p>
-      <w:r>
-        <w:t xml:space="preserve">Tasks that were updated recently get a small score boost. </w:t>
-      </w:r>
-    </w:p>
-    <w:p>
-      <w:pPr>
-        <w:pStyle w:val="Heading1"/>
-      </w:pPr>
-      <w:r>
-        <w:t>Reflection:</w:t>
+        <w:t xml:space="preserve"> generated their scores and ranked them.</w:t>
       </w:r>
     </w:p>
     <w:p/>
@@ -412,6 +553,715 @@
 <file path=word/numbering.xml><?xml version="1.0" encoding="utf-8"?>
 <w:numbering xmlns:wpc="http://schemas.microsoft.com/office/word/2010/wordprocessingCanvas" xmlns:cx="http://schemas.microsoft.com/office/drawing/2014/chartex" xmlns:cx1="http://schemas.microsoft.com/office/drawing/2015/9/8/chartex" xmlns:cx2="http://schemas.microsoft.com/office/drawing/2015/10/21/chartex" xmlns:cx3="http://schemas.microsoft.com/office/drawing/2016/5/9/chartex" xmlns:cx4="http://schemas.microsoft.com/office/drawing/2016/5/10/chartex" xmlns:cx5="http://schemas.microsoft.com/office/drawing/2016/5/11/chartex" xmlns:cx6="http://schemas.microsoft.com/office/drawing/2016/5/12/chartex" xmlns:cx7="http://schemas.microsoft.com/office/drawing/2016/5/13/chartex" xmlns:cx8="http://schemas.microsoft.com/office/drawing/2016/5/14/chartex" xmlns:mc="http://schemas.openxmlformats.org/markup-compatibility/2006" xmlns:aink="http://schemas.microsoft.com/office/drawing/2016/ink" xmlns:am3d="http://schemas.microsoft.com/office/drawing/2017/model3d" xmlns:o="urn:schemas-microsoft-com:office:office" xmlns:oel="http://schemas.microsoft.com/office/2019/extlst" xmlns:r="http://schemas.openxmlformats.org/officeDocument/2006/relationships" xmlns:m="http://schemas.openxmlformats.org/officeDocument/2006/math" xmlns:v="urn:schemas-microsoft-com:vml" xmlns:wp14="http://schemas.microsoft.com/office/word/2010/wordprocessingDrawing" xmlns:wp="http://schemas.openxmlformats.org/drawingml/2006/wordprocessingDrawing" xmlns:w10="urn:schemas-microsoft-com:office:word" xmlns:w="http://schemas.openxmlformats.org/wordprocessingml/2006/main" xmlns:w14="http://schemas.microsoft.com/office/word/2010/wordml" xmlns:w15="http://schemas.microsoft.com/office/word/2012/wordml" xmlns:w16cex="http://schemas.microsoft.com/office/word/2018/wordml/cex" xmlns:w16cid="http://schemas.microsoft.com/office/word/2016/wordml/cid" xmlns:w16="http://schemas.microsoft.com/office/word/2018/wordml" xmlns:w16du="http://schemas.microsoft.com/office/word/2023/wordml/word16du" xmlns:w16sdtdh="http://schemas.microsoft.com/office/word/2020/wordml/sdtdatahash" xmlns:w16se="http://schemas.microsoft.com/office/word/2015/wordml/symex" xmlns:wpg="http://schemas.microsoft.com/office/word/2010/wordprocessingGroup" xmlns:wpi="http://schemas.microsoft.com/office/word/2010/wordprocessingInk" xmlns:wne="http://schemas.microsoft.com/office/word/2006/wordml" xmlns:wps="http://schemas.microsoft.com/office/word/2010/wordprocessingShape" mc:Ignorable="w14 w15 w16se w16cid w16 w16cex w16sdtdh w16du wp14">
   <w:abstractNum w:abstractNumId="0" w15:restartNumberingAfterBreak="0">
+    <w:nsid w:val="0CB23936"/>
+    <w:multiLevelType w:val="multilevel"/>
+    <w:tmpl w:val="0E183548"/>
+    <w:lvl w:ilvl="0">
+      <w:start w:val="1"/>
+      <w:numFmt w:val="bullet"/>
+      <w:lvlText w:val=""/>
+      <w:lvlJc w:val="left"/>
+      <w:pPr>
+        <w:tabs>
+          <w:tab w:val="num" w:pos="720"/>
+        </w:tabs>
+        <w:ind w:left="720" w:hanging="360"/>
+      </w:pPr>
+      <w:rPr>
+        <w:rFonts w:ascii="Symbol" w:hAnsi="Symbol" w:hint="default"/>
+        <w:sz w:val="20"/>
+      </w:rPr>
+    </w:lvl>
+    <w:lvl w:ilvl="1" w:tentative="1">
+      <w:start w:val="1"/>
+      <w:numFmt w:val="bullet"/>
+      <w:lvlText w:val="o"/>
+      <w:lvlJc w:val="left"/>
+      <w:pPr>
+        <w:tabs>
+          <w:tab w:val="num" w:pos="1440"/>
+        </w:tabs>
+        <w:ind w:left="1440" w:hanging="360"/>
+      </w:pPr>
+      <w:rPr>
+        <w:rFonts w:ascii="Courier New" w:hAnsi="Courier New" w:hint="default"/>
+        <w:sz w:val="20"/>
+      </w:rPr>
+    </w:lvl>
+    <w:lvl w:ilvl="2" w:tentative="1">
+      <w:start w:val="1"/>
+      <w:numFmt w:val="bullet"/>
+      <w:lvlText w:val=""/>
+      <w:lvlJc w:val="left"/>
+      <w:pPr>
+        <w:tabs>
+          <w:tab w:val="num" w:pos="2160"/>
+        </w:tabs>
+        <w:ind w:left="2160" w:hanging="360"/>
+      </w:pPr>
+      <w:rPr>
+        <w:rFonts w:ascii="Wingdings" w:hAnsi="Wingdings" w:hint="default"/>
+        <w:sz w:val="20"/>
+      </w:rPr>
+    </w:lvl>
+    <w:lvl w:ilvl="3" w:tentative="1">
+      <w:start w:val="1"/>
+      <w:numFmt w:val="bullet"/>
+      <w:lvlText w:val=""/>
+      <w:lvlJc w:val="left"/>
+      <w:pPr>
+        <w:tabs>
+          <w:tab w:val="num" w:pos="2880"/>
+        </w:tabs>
+        <w:ind w:left="2880" w:hanging="360"/>
+      </w:pPr>
+      <w:rPr>
+        <w:rFonts w:ascii="Wingdings" w:hAnsi="Wingdings" w:hint="default"/>
+        <w:sz w:val="20"/>
+      </w:rPr>
+    </w:lvl>
+    <w:lvl w:ilvl="4" w:tentative="1">
+      <w:start w:val="1"/>
+      <w:numFmt w:val="bullet"/>
+      <w:lvlText w:val=""/>
+      <w:lvlJc w:val="left"/>
+      <w:pPr>
+        <w:tabs>
+          <w:tab w:val="num" w:pos="3600"/>
+        </w:tabs>
+        <w:ind w:left="3600" w:hanging="360"/>
+      </w:pPr>
+      <w:rPr>
+        <w:rFonts w:ascii="Wingdings" w:hAnsi="Wingdings" w:hint="default"/>
+        <w:sz w:val="20"/>
+      </w:rPr>
+    </w:lvl>
+    <w:lvl w:ilvl="5" w:tentative="1">
+      <w:start w:val="1"/>
+      <w:numFmt w:val="bullet"/>
+      <w:lvlText w:val=""/>
+      <w:lvlJc w:val="left"/>
+      <w:pPr>
+        <w:tabs>
+          <w:tab w:val="num" w:pos="4320"/>
+        </w:tabs>
+        <w:ind w:left="4320" w:hanging="360"/>
+      </w:pPr>
+      <w:rPr>
+        <w:rFonts w:ascii="Wingdings" w:hAnsi="Wingdings" w:hint="default"/>
+        <w:sz w:val="20"/>
+      </w:rPr>
+    </w:lvl>
+    <w:lvl w:ilvl="6" w:tentative="1">
+      <w:start w:val="1"/>
+      <w:numFmt w:val="bullet"/>
+      <w:lvlText w:val=""/>
+      <w:lvlJc w:val="left"/>
+      <w:pPr>
+        <w:tabs>
+          <w:tab w:val="num" w:pos="5040"/>
+        </w:tabs>
+        <w:ind w:left="5040" w:hanging="360"/>
+      </w:pPr>
+      <w:rPr>
+        <w:rFonts w:ascii="Wingdings" w:hAnsi="Wingdings" w:hint="default"/>
+        <w:sz w:val="20"/>
+      </w:rPr>
+    </w:lvl>
+    <w:lvl w:ilvl="7" w:tentative="1">
+      <w:start w:val="1"/>
+      <w:numFmt w:val="bullet"/>
+      <w:lvlText w:val=""/>
+      <w:lvlJc w:val="left"/>
+      <w:pPr>
+        <w:tabs>
+          <w:tab w:val="num" w:pos="5760"/>
+        </w:tabs>
+        <w:ind w:left="5760" w:hanging="360"/>
+      </w:pPr>
+      <w:rPr>
+        <w:rFonts w:ascii="Wingdings" w:hAnsi="Wingdings" w:hint="default"/>
+        <w:sz w:val="20"/>
+      </w:rPr>
+    </w:lvl>
+    <w:lvl w:ilvl="8" w:tentative="1">
+      <w:start w:val="1"/>
+      <w:numFmt w:val="bullet"/>
+      <w:lvlText w:val=""/>
+      <w:lvlJc w:val="left"/>
+      <w:pPr>
+        <w:tabs>
+          <w:tab w:val="num" w:pos="6480"/>
+        </w:tabs>
+        <w:ind w:left="6480" w:hanging="360"/>
+      </w:pPr>
+      <w:rPr>
+        <w:rFonts w:ascii="Wingdings" w:hAnsi="Wingdings" w:hint="default"/>
+        <w:sz w:val="20"/>
+      </w:rPr>
+    </w:lvl>
+  </w:abstractNum>
+  <w:abstractNum w:abstractNumId="1" w15:restartNumberingAfterBreak="0">
+    <w:nsid w:val="110A52FA"/>
+    <w:multiLevelType w:val="multilevel"/>
+    <w:tmpl w:val="1E286F98"/>
+    <w:lvl w:ilvl="0">
+      <w:start w:val="1"/>
+      <w:numFmt w:val="bullet"/>
+      <w:lvlText w:val=""/>
+      <w:lvlJc w:val="left"/>
+      <w:pPr>
+        <w:tabs>
+          <w:tab w:val="num" w:pos="1080"/>
+        </w:tabs>
+        <w:ind w:left="1080" w:hanging="360"/>
+      </w:pPr>
+      <w:rPr>
+        <w:rFonts w:ascii="Symbol" w:hAnsi="Symbol" w:hint="default"/>
+        <w:sz w:val="20"/>
+      </w:rPr>
+    </w:lvl>
+    <w:lvl w:ilvl="1">
+      <w:start w:val="1"/>
+      <w:numFmt w:val="bullet"/>
+      <w:lvlText w:val="o"/>
+      <w:lvlJc w:val="left"/>
+      <w:pPr>
+        <w:tabs>
+          <w:tab w:val="num" w:pos="1800"/>
+        </w:tabs>
+        <w:ind w:left="1800" w:hanging="360"/>
+      </w:pPr>
+      <w:rPr>
+        <w:rFonts w:ascii="Courier New" w:hAnsi="Courier New" w:hint="default"/>
+        <w:sz w:val="20"/>
+      </w:rPr>
+    </w:lvl>
+    <w:lvl w:ilvl="2" w:tentative="1">
+      <w:start w:val="1"/>
+      <w:numFmt w:val="bullet"/>
+      <w:lvlText w:val=""/>
+      <w:lvlJc w:val="left"/>
+      <w:pPr>
+        <w:tabs>
+          <w:tab w:val="num" w:pos="2520"/>
+        </w:tabs>
+        <w:ind w:left="2520" w:hanging="360"/>
+      </w:pPr>
+      <w:rPr>
+        <w:rFonts w:ascii="Wingdings" w:hAnsi="Wingdings" w:hint="default"/>
+        <w:sz w:val="20"/>
+      </w:rPr>
+    </w:lvl>
+    <w:lvl w:ilvl="3" w:tentative="1">
+      <w:start w:val="1"/>
+      <w:numFmt w:val="bullet"/>
+      <w:lvlText w:val=""/>
+      <w:lvlJc w:val="left"/>
+      <w:pPr>
+        <w:tabs>
+          <w:tab w:val="num" w:pos="3240"/>
+        </w:tabs>
+        <w:ind w:left="3240" w:hanging="360"/>
+      </w:pPr>
+      <w:rPr>
+        <w:rFonts w:ascii="Wingdings" w:hAnsi="Wingdings" w:hint="default"/>
+        <w:sz w:val="20"/>
+      </w:rPr>
+    </w:lvl>
+    <w:lvl w:ilvl="4" w:tentative="1">
+      <w:start w:val="1"/>
+      <w:numFmt w:val="bullet"/>
+      <w:lvlText w:val=""/>
+      <w:lvlJc w:val="left"/>
+      <w:pPr>
+        <w:tabs>
+          <w:tab w:val="num" w:pos="3960"/>
+        </w:tabs>
+        <w:ind w:left="3960" w:hanging="360"/>
+      </w:pPr>
+      <w:rPr>
+        <w:rFonts w:ascii="Wingdings" w:hAnsi="Wingdings" w:hint="default"/>
+        <w:sz w:val="20"/>
+      </w:rPr>
+    </w:lvl>
+    <w:lvl w:ilvl="5" w:tentative="1">
+      <w:start w:val="1"/>
+      <w:numFmt w:val="bullet"/>
+      <w:lvlText w:val=""/>
+      <w:lvlJc w:val="left"/>
+      <w:pPr>
+        <w:tabs>
+          <w:tab w:val="num" w:pos="4680"/>
+        </w:tabs>
+        <w:ind w:left="4680" w:hanging="360"/>
+      </w:pPr>
+      <w:rPr>
+        <w:rFonts w:ascii="Wingdings" w:hAnsi="Wingdings" w:hint="default"/>
+        <w:sz w:val="20"/>
+      </w:rPr>
+    </w:lvl>
+    <w:lvl w:ilvl="6" w:tentative="1">
+      <w:start w:val="1"/>
+      <w:numFmt w:val="bullet"/>
+      <w:lvlText w:val=""/>
+      <w:lvlJc w:val="left"/>
+      <w:pPr>
+        <w:tabs>
+          <w:tab w:val="num" w:pos="5400"/>
+        </w:tabs>
+        <w:ind w:left="5400" w:hanging="360"/>
+      </w:pPr>
+      <w:rPr>
+        <w:rFonts w:ascii="Wingdings" w:hAnsi="Wingdings" w:hint="default"/>
+        <w:sz w:val="20"/>
+      </w:rPr>
+    </w:lvl>
+    <w:lvl w:ilvl="7" w:tentative="1">
+      <w:start w:val="1"/>
+      <w:numFmt w:val="bullet"/>
+      <w:lvlText w:val=""/>
+      <w:lvlJc w:val="left"/>
+      <w:pPr>
+        <w:tabs>
+          <w:tab w:val="num" w:pos="6120"/>
+        </w:tabs>
+        <w:ind w:left="6120" w:hanging="360"/>
+      </w:pPr>
+      <w:rPr>
+        <w:rFonts w:ascii="Wingdings" w:hAnsi="Wingdings" w:hint="default"/>
+        <w:sz w:val="20"/>
+      </w:rPr>
+    </w:lvl>
+    <w:lvl w:ilvl="8" w:tentative="1">
+      <w:start w:val="1"/>
+      <w:numFmt w:val="bullet"/>
+      <w:lvlText w:val=""/>
+      <w:lvlJc w:val="left"/>
+      <w:pPr>
+        <w:tabs>
+          <w:tab w:val="num" w:pos="6840"/>
+        </w:tabs>
+        <w:ind w:left="6840" w:hanging="360"/>
+      </w:pPr>
+      <w:rPr>
+        <w:rFonts w:ascii="Wingdings" w:hAnsi="Wingdings" w:hint="default"/>
+        <w:sz w:val="20"/>
+      </w:rPr>
+    </w:lvl>
+  </w:abstractNum>
+  <w:abstractNum w:abstractNumId="2" w15:restartNumberingAfterBreak="0">
+    <w:nsid w:val="20F647A3"/>
+    <w:multiLevelType w:val="multilevel"/>
+    <w:tmpl w:val="1E286F98"/>
+    <w:lvl w:ilvl="0">
+      <w:start w:val="1"/>
+      <w:numFmt w:val="bullet"/>
+      <w:lvlText w:val=""/>
+      <w:lvlJc w:val="left"/>
+      <w:pPr>
+        <w:tabs>
+          <w:tab w:val="num" w:pos="1080"/>
+        </w:tabs>
+        <w:ind w:left="1080" w:hanging="360"/>
+      </w:pPr>
+      <w:rPr>
+        <w:rFonts w:ascii="Symbol" w:hAnsi="Symbol" w:hint="default"/>
+        <w:sz w:val="20"/>
+      </w:rPr>
+    </w:lvl>
+    <w:lvl w:ilvl="1">
+      <w:start w:val="1"/>
+      <w:numFmt w:val="bullet"/>
+      <w:lvlText w:val="o"/>
+      <w:lvlJc w:val="left"/>
+      <w:pPr>
+        <w:tabs>
+          <w:tab w:val="num" w:pos="1800"/>
+        </w:tabs>
+        <w:ind w:left="1800" w:hanging="360"/>
+      </w:pPr>
+      <w:rPr>
+        <w:rFonts w:ascii="Courier New" w:hAnsi="Courier New" w:hint="default"/>
+        <w:sz w:val="20"/>
+      </w:rPr>
+    </w:lvl>
+    <w:lvl w:ilvl="2" w:tentative="1">
+      <w:start w:val="1"/>
+      <w:numFmt w:val="bullet"/>
+      <w:lvlText w:val=""/>
+      <w:lvlJc w:val="left"/>
+      <w:pPr>
+        <w:tabs>
+          <w:tab w:val="num" w:pos="2520"/>
+        </w:tabs>
+        <w:ind w:left="2520" w:hanging="360"/>
+      </w:pPr>
+      <w:rPr>
+        <w:rFonts w:ascii="Wingdings" w:hAnsi="Wingdings" w:hint="default"/>
+        <w:sz w:val="20"/>
+      </w:rPr>
+    </w:lvl>
+    <w:lvl w:ilvl="3" w:tentative="1">
+      <w:start w:val="1"/>
+      <w:numFmt w:val="bullet"/>
+      <w:lvlText w:val=""/>
+      <w:lvlJc w:val="left"/>
+      <w:pPr>
+        <w:tabs>
+          <w:tab w:val="num" w:pos="3240"/>
+        </w:tabs>
+        <w:ind w:left="3240" w:hanging="360"/>
+      </w:pPr>
+      <w:rPr>
+        <w:rFonts w:ascii="Wingdings" w:hAnsi="Wingdings" w:hint="default"/>
+        <w:sz w:val="20"/>
+      </w:rPr>
+    </w:lvl>
+    <w:lvl w:ilvl="4" w:tentative="1">
+      <w:start w:val="1"/>
+      <w:numFmt w:val="bullet"/>
+      <w:lvlText w:val=""/>
+      <w:lvlJc w:val="left"/>
+      <w:pPr>
+        <w:tabs>
+          <w:tab w:val="num" w:pos="3960"/>
+        </w:tabs>
+        <w:ind w:left="3960" w:hanging="360"/>
+      </w:pPr>
+      <w:rPr>
+        <w:rFonts w:ascii="Wingdings" w:hAnsi="Wingdings" w:hint="default"/>
+        <w:sz w:val="20"/>
+      </w:rPr>
+    </w:lvl>
+    <w:lvl w:ilvl="5" w:tentative="1">
+      <w:start w:val="1"/>
+      <w:numFmt w:val="bullet"/>
+      <w:lvlText w:val=""/>
+      <w:lvlJc w:val="left"/>
+      <w:pPr>
+        <w:tabs>
+          <w:tab w:val="num" w:pos="4680"/>
+        </w:tabs>
+        <w:ind w:left="4680" w:hanging="360"/>
+      </w:pPr>
+      <w:rPr>
+        <w:rFonts w:ascii="Wingdings" w:hAnsi="Wingdings" w:hint="default"/>
+        <w:sz w:val="20"/>
+      </w:rPr>
+    </w:lvl>
+    <w:lvl w:ilvl="6" w:tentative="1">
+      <w:start w:val="1"/>
+      <w:numFmt w:val="bullet"/>
+      <w:lvlText w:val=""/>
+      <w:lvlJc w:val="left"/>
+      <w:pPr>
+        <w:tabs>
+          <w:tab w:val="num" w:pos="5400"/>
+        </w:tabs>
+        <w:ind w:left="5400" w:hanging="360"/>
+      </w:pPr>
+      <w:rPr>
+        <w:rFonts w:ascii="Wingdings" w:hAnsi="Wingdings" w:hint="default"/>
+        <w:sz w:val="20"/>
+      </w:rPr>
+    </w:lvl>
+    <w:lvl w:ilvl="7" w:tentative="1">
+      <w:start w:val="1"/>
+      <w:numFmt w:val="bullet"/>
+      <w:lvlText w:val=""/>
+      <w:lvlJc w:val="left"/>
+      <w:pPr>
+        <w:tabs>
+          <w:tab w:val="num" w:pos="6120"/>
+        </w:tabs>
+        <w:ind w:left="6120" w:hanging="360"/>
+      </w:pPr>
+      <w:rPr>
+        <w:rFonts w:ascii="Wingdings" w:hAnsi="Wingdings" w:hint="default"/>
+        <w:sz w:val="20"/>
+      </w:rPr>
+    </w:lvl>
+    <w:lvl w:ilvl="8" w:tentative="1">
+      <w:start w:val="1"/>
+      <w:numFmt w:val="bullet"/>
+      <w:lvlText w:val=""/>
+      <w:lvlJc w:val="left"/>
+      <w:pPr>
+        <w:tabs>
+          <w:tab w:val="num" w:pos="6840"/>
+        </w:tabs>
+        <w:ind w:left="6840" w:hanging="360"/>
+      </w:pPr>
+      <w:rPr>
+        <w:rFonts w:ascii="Wingdings" w:hAnsi="Wingdings" w:hint="default"/>
+        <w:sz w:val="20"/>
+      </w:rPr>
+    </w:lvl>
+  </w:abstractNum>
+  <w:abstractNum w:abstractNumId="3" w15:restartNumberingAfterBreak="0">
+    <w:nsid w:val="2393651A"/>
+    <w:multiLevelType w:val="hybridMultilevel"/>
+    <w:tmpl w:val="C7CE9D74"/>
+    <w:lvl w:ilvl="0" w:tplc="04090003">
+      <w:start w:val="1"/>
+      <w:numFmt w:val="bullet"/>
+      <w:lvlText w:val="o"/>
+      <w:lvlJc w:val="left"/>
+      <w:pPr>
+        <w:ind w:left="1440" w:hanging="360"/>
+      </w:pPr>
+      <w:rPr>
+        <w:rFonts w:ascii="Courier New" w:hAnsi="Courier New" w:cs="Courier New" w:hint="default"/>
+      </w:rPr>
+    </w:lvl>
+    <w:lvl w:ilvl="1" w:tplc="04090003" w:tentative="1">
+      <w:start w:val="1"/>
+      <w:numFmt w:val="bullet"/>
+      <w:lvlText w:val="o"/>
+      <w:lvlJc w:val="left"/>
+      <w:pPr>
+        <w:ind w:left="2160" w:hanging="360"/>
+      </w:pPr>
+      <w:rPr>
+        <w:rFonts w:ascii="Courier New" w:hAnsi="Courier New" w:cs="Courier New" w:hint="default"/>
+      </w:rPr>
+    </w:lvl>
+    <w:lvl w:ilvl="2" w:tplc="04090005" w:tentative="1">
+      <w:start w:val="1"/>
+      <w:numFmt w:val="bullet"/>
+      <w:lvlText w:val=""/>
+      <w:lvlJc w:val="left"/>
+      <w:pPr>
+        <w:ind w:left="2880" w:hanging="360"/>
+      </w:pPr>
+      <w:rPr>
+        <w:rFonts w:ascii="Wingdings" w:hAnsi="Wingdings" w:hint="default"/>
+      </w:rPr>
+    </w:lvl>
+    <w:lvl w:ilvl="3" w:tplc="04090001" w:tentative="1">
+      <w:start w:val="1"/>
+      <w:numFmt w:val="bullet"/>
+      <w:lvlText w:val=""/>
+      <w:lvlJc w:val="left"/>
+      <w:pPr>
+        <w:ind w:left="3600" w:hanging="360"/>
+      </w:pPr>
+      <w:rPr>
+        <w:rFonts w:ascii="Symbol" w:hAnsi="Symbol" w:hint="default"/>
+      </w:rPr>
+    </w:lvl>
+    <w:lvl w:ilvl="4" w:tplc="04090003" w:tentative="1">
+      <w:start w:val="1"/>
+      <w:numFmt w:val="bullet"/>
+      <w:lvlText w:val="o"/>
+      <w:lvlJc w:val="left"/>
+      <w:pPr>
+        <w:ind w:left="4320" w:hanging="360"/>
+      </w:pPr>
+      <w:rPr>
+        <w:rFonts w:ascii="Courier New" w:hAnsi="Courier New" w:cs="Courier New" w:hint="default"/>
+      </w:rPr>
+    </w:lvl>
+    <w:lvl w:ilvl="5" w:tplc="04090005" w:tentative="1">
+      <w:start w:val="1"/>
+      <w:numFmt w:val="bullet"/>
+      <w:lvlText w:val=""/>
+      <w:lvlJc w:val="left"/>
+      <w:pPr>
+        <w:ind w:left="5040" w:hanging="360"/>
+      </w:pPr>
+      <w:rPr>
+        <w:rFonts w:ascii="Wingdings" w:hAnsi="Wingdings" w:hint="default"/>
+      </w:rPr>
+    </w:lvl>
+    <w:lvl w:ilvl="6" w:tplc="04090001" w:tentative="1">
+      <w:start w:val="1"/>
+      <w:numFmt w:val="bullet"/>
+      <w:lvlText w:val=""/>
+      <w:lvlJc w:val="left"/>
+      <w:pPr>
+        <w:ind w:left="5760" w:hanging="360"/>
+      </w:pPr>
+      <w:rPr>
+        <w:rFonts w:ascii="Symbol" w:hAnsi="Symbol" w:hint="default"/>
+      </w:rPr>
+    </w:lvl>
+    <w:lvl w:ilvl="7" w:tplc="04090003" w:tentative="1">
+      <w:start w:val="1"/>
+      <w:numFmt w:val="bullet"/>
+      <w:lvlText w:val="o"/>
+      <w:lvlJc w:val="left"/>
+      <w:pPr>
+        <w:ind w:left="6480" w:hanging="360"/>
+      </w:pPr>
+      <w:rPr>
+        <w:rFonts w:ascii="Courier New" w:hAnsi="Courier New" w:cs="Courier New" w:hint="default"/>
+      </w:rPr>
+    </w:lvl>
+    <w:lvl w:ilvl="8" w:tplc="04090005" w:tentative="1">
+      <w:start w:val="1"/>
+      <w:numFmt w:val="bullet"/>
+      <w:lvlText w:val=""/>
+      <w:lvlJc w:val="left"/>
+      <w:pPr>
+        <w:ind w:left="7200" w:hanging="360"/>
+      </w:pPr>
+      <w:rPr>
+        <w:rFonts w:ascii="Wingdings" w:hAnsi="Wingdings" w:hint="default"/>
+      </w:rPr>
+    </w:lvl>
+  </w:abstractNum>
+  <w:abstractNum w:abstractNumId="4" w15:restartNumberingAfterBreak="0">
+    <w:nsid w:val="2CE622C4"/>
+    <w:multiLevelType w:val="multilevel"/>
+    <w:tmpl w:val="CF0A52EC"/>
+    <w:lvl w:ilvl="0">
+      <w:start w:val="1"/>
+      <w:numFmt w:val="bullet"/>
+      <w:lvlText w:val=""/>
+      <w:lvlJc w:val="left"/>
+      <w:pPr>
+        <w:tabs>
+          <w:tab w:val="num" w:pos="720"/>
+        </w:tabs>
+        <w:ind w:left="720" w:hanging="360"/>
+      </w:pPr>
+      <w:rPr>
+        <w:rFonts w:ascii="Symbol" w:hAnsi="Symbol" w:hint="default"/>
+        <w:sz w:val="20"/>
+      </w:rPr>
+    </w:lvl>
+    <w:lvl w:ilvl="1" w:tentative="1">
+      <w:start w:val="1"/>
+      <w:numFmt w:val="bullet"/>
+      <w:lvlText w:val="o"/>
+      <w:lvlJc w:val="left"/>
+      <w:pPr>
+        <w:tabs>
+          <w:tab w:val="num" w:pos="1440"/>
+        </w:tabs>
+        <w:ind w:left="1440" w:hanging="360"/>
+      </w:pPr>
+      <w:rPr>
+        <w:rFonts w:ascii="Courier New" w:hAnsi="Courier New" w:hint="default"/>
+        <w:sz w:val="20"/>
+      </w:rPr>
+    </w:lvl>
+    <w:lvl w:ilvl="2" w:tentative="1">
+      <w:start w:val="1"/>
+      <w:numFmt w:val="bullet"/>
+      <w:lvlText w:val=""/>
+      <w:lvlJc w:val="left"/>
+      <w:pPr>
+        <w:tabs>
+          <w:tab w:val="num" w:pos="2160"/>
+        </w:tabs>
+        <w:ind w:left="2160" w:hanging="360"/>
+      </w:pPr>
+      <w:rPr>
+        <w:rFonts w:ascii="Wingdings" w:hAnsi="Wingdings" w:hint="default"/>
+        <w:sz w:val="20"/>
+      </w:rPr>
+    </w:lvl>
+    <w:lvl w:ilvl="3" w:tentative="1">
+      <w:start w:val="1"/>
+      <w:numFmt w:val="bullet"/>
+      <w:lvlText w:val=""/>
+      <w:lvlJc w:val="left"/>
+      <w:pPr>
+        <w:tabs>
+          <w:tab w:val="num" w:pos="2880"/>
+        </w:tabs>
+        <w:ind w:left="2880" w:hanging="360"/>
+      </w:pPr>
+      <w:rPr>
+        <w:rFonts w:ascii="Wingdings" w:hAnsi="Wingdings" w:hint="default"/>
+        <w:sz w:val="20"/>
+      </w:rPr>
+    </w:lvl>
+    <w:lvl w:ilvl="4" w:tentative="1">
+      <w:start w:val="1"/>
+      <w:numFmt w:val="bullet"/>
+      <w:lvlText w:val=""/>
+      <w:lvlJc w:val="left"/>
+      <w:pPr>
+        <w:tabs>
+          <w:tab w:val="num" w:pos="3600"/>
+        </w:tabs>
+        <w:ind w:left="3600" w:hanging="360"/>
+      </w:pPr>
+      <w:rPr>
+        <w:rFonts w:ascii="Wingdings" w:hAnsi="Wingdings" w:hint="default"/>
+        <w:sz w:val="20"/>
+      </w:rPr>
+    </w:lvl>
+    <w:lvl w:ilvl="5" w:tentative="1">
+      <w:start w:val="1"/>
+      <w:numFmt w:val="bullet"/>
+      <w:lvlText w:val=""/>
+      <w:lvlJc w:val="left"/>
+      <w:pPr>
+        <w:tabs>
+          <w:tab w:val="num" w:pos="4320"/>
+        </w:tabs>
+        <w:ind w:left="4320" w:hanging="360"/>
+      </w:pPr>
+      <w:rPr>
+        <w:rFonts w:ascii="Wingdings" w:hAnsi="Wingdings" w:hint="default"/>
+        <w:sz w:val="20"/>
+      </w:rPr>
+    </w:lvl>
+    <w:lvl w:ilvl="6" w:tentative="1">
+      <w:start w:val="1"/>
+      <w:numFmt w:val="bullet"/>
+      <w:lvlText w:val=""/>
+      <w:lvlJc w:val="left"/>
+      <w:pPr>
+        <w:tabs>
+          <w:tab w:val="num" w:pos="5040"/>
+        </w:tabs>
+        <w:ind w:left="5040" w:hanging="360"/>
+      </w:pPr>
+      <w:rPr>
+        <w:rFonts w:ascii="Wingdings" w:hAnsi="Wingdings" w:hint="default"/>
+        <w:sz w:val="20"/>
+      </w:rPr>
+    </w:lvl>
+    <w:lvl w:ilvl="7" w:tentative="1">
+      <w:start w:val="1"/>
+      <w:numFmt w:val="bullet"/>
+      <w:lvlText w:val=""/>
+      <w:lvlJc w:val="left"/>
+      <w:pPr>
+        <w:tabs>
+          <w:tab w:val="num" w:pos="5760"/>
+        </w:tabs>
+        <w:ind w:left="5760" w:hanging="360"/>
+      </w:pPr>
+      <w:rPr>
+        <w:rFonts w:ascii="Wingdings" w:hAnsi="Wingdings" w:hint="default"/>
+        <w:sz w:val="20"/>
+      </w:rPr>
+    </w:lvl>
+    <w:lvl w:ilvl="8" w:tentative="1">
+      <w:start w:val="1"/>
+      <w:numFmt w:val="bullet"/>
+      <w:lvlText w:val=""/>
+      <w:lvlJc w:val="left"/>
+      <w:pPr>
+        <w:tabs>
+          <w:tab w:val="num" w:pos="6480"/>
+        </w:tabs>
+        <w:ind w:left="6480" w:hanging="360"/>
+      </w:pPr>
+      <w:rPr>
+        <w:rFonts w:ascii="Wingdings" w:hAnsi="Wingdings" w:hint="default"/>
+        <w:sz w:val="20"/>
+      </w:rPr>
+    </w:lvl>
+  </w:abstractNum>
+  <w:abstractNum w:abstractNumId="5" w15:restartNumberingAfterBreak="0">
     <w:nsid w:val="2D89274B"/>
     <w:multiLevelType w:val="hybridMultilevel"/>
     <w:tmpl w:val="4D620866"/>
@@ -497,8 +1347,523 @@
       </w:pPr>
     </w:lvl>
   </w:abstractNum>
+  <w:abstractNum w:abstractNumId="6" w15:restartNumberingAfterBreak="0">
+    <w:nsid w:val="368B34D4"/>
+    <w:multiLevelType w:val="multilevel"/>
+    <w:tmpl w:val="1E286F98"/>
+    <w:lvl w:ilvl="0">
+      <w:start w:val="1"/>
+      <w:numFmt w:val="bullet"/>
+      <w:lvlText w:val=""/>
+      <w:lvlJc w:val="left"/>
+      <w:pPr>
+        <w:tabs>
+          <w:tab w:val="num" w:pos="1080"/>
+        </w:tabs>
+        <w:ind w:left="1080" w:hanging="360"/>
+      </w:pPr>
+      <w:rPr>
+        <w:rFonts w:ascii="Symbol" w:hAnsi="Symbol" w:hint="default"/>
+        <w:sz w:val="20"/>
+      </w:rPr>
+    </w:lvl>
+    <w:lvl w:ilvl="1">
+      <w:start w:val="1"/>
+      <w:numFmt w:val="bullet"/>
+      <w:lvlText w:val="o"/>
+      <w:lvlJc w:val="left"/>
+      <w:pPr>
+        <w:tabs>
+          <w:tab w:val="num" w:pos="1800"/>
+        </w:tabs>
+        <w:ind w:left="1800" w:hanging="360"/>
+      </w:pPr>
+      <w:rPr>
+        <w:rFonts w:ascii="Courier New" w:hAnsi="Courier New" w:hint="default"/>
+        <w:sz w:val="20"/>
+      </w:rPr>
+    </w:lvl>
+    <w:lvl w:ilvl="2" w:tentative="1">
+      <w:start w:val="1"/>
+      <w:numFmt w:val="bullet"/>
+      <w:lvlText w:val=""/>
+      <w:lvlJc w:val="left"/>
+      <w:pPr>
+        <w:tabs>
+          <w:tab w:val="num" w:pos="2520"/>
+        </w:tabs>
+        <w:ind w:left="2520" w:hanging="360"/>
+      </w:pPr>
+      <w:rPr>
+        <w:rFonts w:ascii="Wingdings" w:hAnsi="Wingdings" w:hint="default"/>
+        <w:sz w:val="20"/>
+      </w:rPr>
+    </w:lvl>
+    <w:lvl w:ilvl="3" w:tentative="1">
+      <w:start w:val="1"/>
+      <w:numFmt w:val="bullet"/>
+      <w:lvlText w:val=""/>
+      <w:lvlJc w:val="left"/>
+      <w:pPr>
+        <w:tabs>
+          <w:tab w:val="num" w:pos="3240"/>
+        </w:tabs>
+        <w:ind w:left="3240" w:hanging="360"/>
+      </w:pPr>
+      <w:rPr>
+        <w:rFonts w:ascii="Wingdings" w:hAnsi="Wingdings" w:hint="default"/>
+        <w:sz w:val="20"/>
+      </w:rPr>
+    </w:lvl>
+    <w:lvl w:ilvl="4" w:tentative="1">
+      <w:start w:val="1"/>
+      <w:numFmt w:val="bullet"/>
+      <w:lvlText w:val=""/>
+      <w:lvlJc w:val="left"/>
+      <w:pPr>
+        <w:tabs>
+          <w:tab w:val="num" w:pos="3960"/>
+        </w:tabs>
+        <w:ind w:left="3960" w:hanging="360"/>
+      </w:pPr>
+      <w:rPr>
+        <w:rFonts w:ascii="Wingdings" w:hAnsi="Wingdings" w:hint="default"/>
+        <w:sz w:val="20"/>
+      </w:rPr>
+    </w:lvl>
+    <w:lvl w:ilvl="5" w:tentative="1">
+      <w:start w:val="1"/>
+      <w:numFmt w:val="bullet"/>
+      <w:lvlText w:val=""/>
+      <w:lvlJc w:val="left"/>
+      <w:pPr>
+        <w:tabs>
+          <w:tab w:val="num" w:pos="4680"/>
+        </w:tabs>
+        <w:ind w:left="4680" w:hanging="360"/>
+      </w:pPr>
+      <w:rPr>
+        <w:rFonts w:ascii="Wingdings" w:hAnsi="Wingdings" w:hint="default"/>
+        <w:sz w:val="20"/>
+      </w:rPr>
+    </w:lvl>
+    <w:lvl w:ilvl="6" w:tentative="1">
+      <w:start w:val="1"/>
+      <w:numFmt w:val="bullet"/>
+      <w:lvlText w:val=""/>
+      <w:lvlJc w:val="left"/>
+      <w:pPr>
+        <w:tabs>
+          <w:tab w:val="num" w:pos="5400"/>
+        </w:tabs>
+        <w:ind w:left="5400" w:hanging="360"/>
+      </w:pPr>
+      <w:rPr>
+        <w:rFonts w:ascii="Wingdings" w:hAnsi="Wingdings" w:hint="default"/>
+        <w:sz w:val="20"/>
+      </w:rPr>
+    </w:lvl>
+    <w:lvl w:ilvl="7" w:tentative="1">
+      <w:start w:val="1"/>
+      <w:numFmt w:val="bullet"/>
+      <w:lvlText w:val=""/>
+      <w:lvlJc w:val="left"/>
+      <w:pPr>
+        <w:tabs>
+          <w:tab w:val="num" w:pos="6120"/>
+        </w:tabs>
+        <w:ind w:left="6120" w:hanging="360"/>
+      </w:pPr>
+      <w:rPr>
+        <w:rFonts w:ascii="Wingdings" w:hAnsi="Wingdings" w:hint="default"/>
+        <w:sz w:val="20"/>
+      </w:rPr>
+    </w:lvl>
+    <w:lvl w:ilvl="8" w:tentative="1">
+      <w:start w:val="1"/>
+      <w:numFmt w:val="bullet"/>
+      <w:lvlText w:val=""/>
+      <w:lvlJc w:val="left"/>
+      <w:pPr>
+        <w:tabs>
+          <w:tab w:val="num" w:pos="6840"/>
+        </w:tabs>
+        <w:ind w:left="6840" w:hanging="360"/>
+      </w:pPr>
+      <w:rPr>
+        <w:rFonts w:ascii="Wingdings" w:hAnsi="Wingdings" w:hint="default"/>
+        <w:sz w:val="20"/>
+      </w:rPr>
+    </w:lvl>
+  </w:abstractNum>
+  <w:abstractNum w:abstractNumId="7" w15:restartNumberingAfterBreak="0">
+    <w:nsid w:val="458E0D78"/>
+    <w:multiLevelType w:val="hybridMultilevel"/>
+    <w:tmpl w:val="D4D46AA0"/>
+    <w:lvl w:ilvl="0" w:tplc="04090001">
+      <w:start w:val="1"/>
+      <w:numFmt w:val="bullet"/>
+      <w:lvlText w:val=""/>
+      <w:lvlJc w:val="left"/>
+      <w:pPr>
+        <w:ind w:left="720" w:hanging="360"/>
+      </w:pPr>
+      <w:rPr>
+        <w:rFonts w:ascii="Symbol" w:hAnsi="Symbol" w:hint="default"/>
+      </w:rPr>
+    </w:lvl>
+    <w:lvl w:ilvl="1" w:tplc="04090003" w:tentative="1">
+      <w:start w:val="1"/>
+      <w:numFmt w:val="bullet"/>
+      <w:lvlText w:val="o"/>
+      <w:lvlJc w:val="left"/>
+      <w:pPr>
+        <w:ind w:left="1440" w:hanging="360"/>
+      </w:pPr>
+      <w:rPr>
+        <w:rFonts w:ascii="Courier New" w:hAnsi="Courier New" w:cs="Courier New" w:hint="default"/>
+      </w:rPr>
+    </w:lvl>
+    <w:lvl w:ilvl="2" w:tplc="04090005" w:tentative="1">
+      <w:start w:val="1"/>
+      <w:numFmt w:val="bullet"/>
+      <w:lvlText w:val=""/>
+      <w:lvlJc w:val="left"/>
+      <w:pPr>
+        <w:ind w:left="2160" w:hanging="360"/>
+      </w:pPr>
+      <w:rPr>
+        <w:rFonts w:ascii="Wingdings" w:hAnsi="Wingdings" w:hint="default"/>
+      </w:rPr>
+    </w:lvl>
+    <w:lvl w:ilvl="3" w:tplc="04090001" w:tentative="1">
+      <w:start w:val="1"/>
+      <w:numFmt w:val="bullet"/>
+      <w:lvlText w:val=""/>
+      <w:lvlJc w:val="left"/>
+      <w:pPr>
+        <w:ind w:left="2880" w:hanging="360"/>
+      </w:pPr>
+      <w:rPr>
+        <w:rFonts w:ascii="Symbol" w:hAnsi="Symbol" w:hint="default"/>
+      </w:rPr>
+    </w:lvl>
+    <w:lvl w:ilvl="4" w:tplc="04090003" w:tentative="1">
+      <w:start w:val="1"/>
+      <w:numFmt w:val="bullet"/>
+      <w:lvlText w:val="o"/>
+      <w:lvlJc w:val="left"/>
+      <w:pPr>
+        <w:ind w:left="3600" w:hanging="360"/>
+      </w:pPr>
+      <w:rPr>
+        <w:rFonts w:ascii="Courier New" w:hAnsi="Courier New" w:cs="Courier New" w:hint="default"/>
+      </w:rPr>
+    </w:lvl>
+    <w:lvl w:ilvl="5" w:tplc="04090005" w:tentative="1">
+      <w:start w:val="1"/>
+      <w:numFmt w:val="bullet"/>
+      <w:lvlText w:val=""/>
+      <w:lvlJc w:val="left"/>
+      <w:pPr>
+        <w:ind w:left="4320" w:hanging="360"/>
+      </w:pPr>
+      <w:rPr>
+        <w:rFonts w:ascii="Wingdings" w:hAnsi="Wingdings" w:hint="default"/>
+      </w:rPr>
+    </w:lvl>
+    <w:lvl w:ilvl="6" w:tplc="04090001" w:tentative="1">
+      <w:start w:val="1"/>
+      <w:numFmt w:val="bullet"/>
+      <w:lvlText w:val=""/>
+      <w:lvlJc w:val="left"/>
+      <w:pPr>
+        <w:ind w:left="5040" w:hanging="360"/>
+      </w:pPr>
+      <w:rPr>
+        <w:rFonts w:ascii="Symbol" w:hAnsi="Symbol" w:hint="default"/>
+      </w:rPr>
+    </w:lvl>
+    <w:lvl w:ilvl="7" w:tplc="04090003" w:tentative="1">
+      <w:start w:val="1"/>
+      <w:numFmt w:val="bullet"/>
+      <w:lvlText w:val="o"/>
+      <w:lvlJc w:val="left"/>
+      <w:pPr>
+        <w:ind w:left="5760" w:hanging="360"/>
+      </w:pPr>
+      <w:rPr>
+        <w:rFonts w:ascii="Courier New" w:hAnsi="Courier New" w:cs="Courier New" w:hint="default"/>
+      </w:rPr>
+    </w:lvl>
+    <w:lvl w:ilvl="8" w:tplc="04090005" w:tentative="1">
+      <w:start w:val="1"/>
+      <w:numFmt w:val="bullet"/>
+      <w:lvlText w:val=""/>
+      <w:lvlJc w:val="left"/>
+      <w:pPr>
+        <w:ind w:left="6480" w:hanging="360"/>
+      </w:pPr>
+      <w:rPr>
+        <w:rFonts w:ascii="Wingdings" w:hAnsi="Wingdings" w:hint="default"/>
+      </w:rPr>
+    </w:lvl>
+  </w:abstractNum>
+  <w:abstractNum w:abstractNumId="8" w15:restartNumberingAfterBreak="0">
+    <w:nsid w:val="62745512"/>
+    <w:multiLevelType w:val="hybridMultilevel"/>
+    <w:tmpl w:val="920C671E"/>
+    <w:lvl w:ilvl="0" w:tplc="04090001">
+      <w:start w:val="1"/>
+      <w:numFmt w:val="bullet"/>
+      <w:lvlText w:val=""/>
+      <w:lvlJc w:val="left"/>
+      <w:pPr>
+        <w:ind w:left="720" w:hanging="360"/>
+      </w:pPr>
+      <w:rPr>
+        <w:rFonts w:ascii="Symbol" w:hAnsi="Symbol" w:hint="default"/>
+      </w:rPr>
+    </w:lvl>
+    <w:lvl w:ilvl="1" w:tplc="04090003" w:tentative="1">
+      <w:start w:val="1"/>
+      <w:numFmt w:val="bullet"/>
+      <w:lvlText w:val="o"/>
+      <w:lvlJc w:val="left"/>
+      <w:pPr>
+        <w:ind w:left="1440" w:hanging="360"/>
+      </w:pPr>
+      <w:rPr>
+        <w:rFonts w:ascii="Courier New" w:hAnsi="Courier New" w:cs="Courier New" w:hint="default"/>
+      </w:rPr>
+    </w:lvl>
+    <w:lvl w:ilvl="2" w:tplc="04090005" w:tentative="1">
+      <w:start w:val="1"/>
+      <w:numFmt w:val="bullet"/>
+      <w:lvlText w:val=""/>
+      <w:lvlJc w:val="left"/>
+      <w:pPr>
+        <w:ind w:left="2160" w:hanging="360"/>
+      </w:pPr>
+      <w:rPr>
+        <w:rFonts w:ascii="Wingdings" w:hAnsi="Wingdings" w:hint="default"/>
+      </w:rPr>
+    </w:lvl>
+    <w:lvl w:ilvl="3" w:tplc="04090001" w:tentative="1">
+      <w:start w:val="1"/>
+      <w:numFmt w:val="bullet"/>
+      <w:lvlText w:val=""/>
+      <w:lvlJc w:val="left"/>
+      <w:pPr>
+        <w:ind w:left="2880" w:hanging="360"/>
+      </w:pPr>
+      <w:rPr>
+        <w:rFonts w:ascii="Symbol" w:hAnsi="Symbol" w:hint="default"/>
+      </w:rPr>
+    </w:lvl>
+    <w:lvl w:ilvl="4" w:tplc="04090003" w:tentative="1">
+      <w:start w:val="1"/>
+      <w:numFmt w:val="bullet"/>
+      <w:lvlText w:val="o"/>
+      <w:lvlJc w:val="left"/>
+      <w:pPr>
+        <w:ind w:left="3600" w:hanging="360"/>
+      </w:pPr>
+      <w:rPr>
+        <w:rFonts w:ascii="Courier New" w:hAnsi="Courier New" w:cs="Courier New" w:hint="default"/>
+      </w:rPr>
+    </w:lvl>
+    <w:lvl w:ilvl="5" w:tplc="04090005" w:tentative="1">
+      <w:start w:val="1"/>
+      <w:numFmt w:val="bullet"/>
+      <w:lvlText w:val=""/>
+      <w:lvlJc w:val="left"/>
+      <w:pPr>
+        <w:ind w:left="4320" w:hanging="360"/>
+      </w:pPr>
+      <w:rPr>
+        <w:rFonts w:ascii="Wingdings" w:hAnsi="Wingdings" w:hint="default"/>
+      </w:rPr>
+    </w:lvl>
+    <w:lvl w:ilvl="6" w:tplc="04090001" w:tentative="1">
+      <w:start w:val="1"/>
+      <w:numFmt w:val="bullet"/>
+      <w:lvlText w:val=""/>
+      <w:lvlJc w:val="left"/>
+      <w:pPr>
+        <w:ind w:left="5040" w:hanging="360"/>
+      </w:pPr>
+      <w:rPr>
+        <w:rFonts w:ascii="Symbol" w:hAnsi="Symbol" w:hint="default"/>
+      </w:rPr>
+    </w:lvl>
+    <w:lvl w:ilvl="7" w:tplc="04090003" w:tentative="1">
+      <w:start w:val="1"/>
+      <w:numFmt w:val="bullet"/>
+      <w:lvlText w:val="o"/>
+      <w:lvlJc w:val="left"/>
+      <w:pPr>
+        <w:ind w:left="5760" w:hanging="360"/>
+      </w:pPr>
+      <w:rPr>
+        <w:rFonts w:ascii="Courier New" w:hAnsi="Courier New" w:cs="Courier New" w:hint="default"/>
+      </w:rPr>
+    </w:lvl>
+    <w:lvl w:ilvl="8" w:tplc="04090005" w:tentative="1">
+      <w:start w:val="1"/>
+      <w:numFmt w:val="bullet"/>
+      <w:lvlText w:val=""/>
+      <w:lvlJc w:val="left"/>
+      <w:pPr>
+        <w:ind w:left="6480" w:hanging="360"/>
+      </w:pPr>
+      <w:rPr>
+        <w:rFonts w:ascii="Wingdings" w:hAnsi="Wingdings" w:hint="default"/>
+      </w:rPr>
+    </w:lvl>
+  </w:abstractNum>
+  <w:abstractNum w:abstractNumId="9" w15:restartNumberingAfterBreak="0">
+    <w:nsid w:val="771107A3"/>
+    <w:multiLevelType w:val="hybridMultilevel"/>
+    <w:tmpl w:val="46660356"/>
+    <w:lvl w:ilvl="0" w:tplc="04090001">
+      <w:start w:val="1"/>
+      <w:numFmt w:val="bullet"/>
+      <w:lvlText w:val=""/>
+      <w:lvlJc w:val="left"/>
+      <w:pPr>
+        <w:ind w:left="720" w:hanging="360"/>
+      </w:pPr>
+      <w:rPr>
+        <w:rFonts w:ascii="Symbol" w:hAnsi="Symbol" w:hint="default"/>
+      </w:rPr>
+    </w:lvl>
+    <w:lvl w:ilvl="1" w:tplc="04090003" w:tentative="1">
+      <w:start w:val="1"/>
+      <w:numFmt w:val="bullet"/>
+      <w:lvlText w:val="o"/>
+      <w:lvlJc w:val="left"/>
+      <w:pPr>
+        <w:ind w:left="1440" w:hanging="360"/>
+      </w:pPr>
+      <w:rPr>
+        <w:rFonts w:ascii="Courier New" w:hAnsi="Courier New" w:cs="Courier New" w:hint="default"/>
+      </w:rPr>
+    </w:lvl>
+    <w:lvl w:ilvl="2" w:tplc="04090005" w:tentative="1">
+      <w:start w:val="1"/>
+      <w:numFmt w:val="bullet"/>
+      <w:lvlText w:val=""/>
+      <w:lvlJc w:val="left"/>
+      <w:pPr>
+        <w:ind w:left="2160" w:hanging="360"/>
+      </w:pPr>
+      <w:rPr>
+        <w:rFonts w:ascii="Wingdings" w:hAnsi="Wingdings" w:hint="default"/>
+      </w:rPr>
+    </w:lvl>
+    <w:lvl w:ilvl="3" w:tplc="04090001" w:tentative="1">
+      <w:start w:val="1"/>
+      <w:numFmt w:val="bullet"/>
+      <w:lvlText w:val=""/>
+      <w:lvlJc w:val="left"/>
+      <w:pPr>
+        <w:ind w:left="2880" w:hanging="360"/>
+      </w:pPr>
+      <w:rPr>
+        <w:rFonts w:ascii="Symbol" w:hAnsi="Symbol" w:hint="default"/>
+      </w:rPr>
+    </w:lvl>
+    <w:lvl w:ilvl="4" w:tplc="04090003" w:tentative="1">
+      <w:start w:val="1"/>
+      <w:numFmt w:val="bullet"/>
+      <w:lvlText w:val="o"/>
+      <w:lvlJc w:val="left"/>
+      <w:pPr>
+        <w:ind w:left="3600" w:hanging="360"/>
+      </w:pPr>
+      <w:rPr>
+        <w:rFonts w:ascii="Courier New" w:hAnsi="Courier New" w:cs="Courier New" w:hint="default"/>
+      </w:rPr>
+    </w:lvl>
+    <w:lvl w:ilvl="5" w:tplc="04090005" w:tentative="1">
+      <w:start w:val="1"/>
+      <w:numFmt w:val="bullet"/>
+      <w:lvlText w:val=""/>
+      <w:lvlJc w:val="left"/>
+      <w:pPr>
+        <w:ind w:left="4320" w:hanging="360"/>
+      </w:pPr>
+      <w:rPr>
+        <w:rFonts w:ascii="Wingdings" w:hAnsi="Wingdings" w:hint="default"/>
+      </w:rPr>
+    </w:lvl>
+    <w:lvl w:ilvl="6" w:tplc="04090001" w:tentative="1">
+      <w:start w:val="1"/>
+      <w:numFmt w:val="bullet"/>
+      <w:lvlText w:val=""/>
+      <w:lvlJc w:val="left"/>
+      <w:pPr>
+        <w:ind w:left="5040" w:hanging="360"/>
+      </w:pPr>
+      <w:rPr>
+        <w:rFonts w:ascii="Symbol" w:hAnsi="Symbol" w:hint="default"/>
+      </w:rPr>
+    </w:lvl>
+    <w:lvl w:ilvl="7" w:tplc="04090003" w:tentative="1">
+      <w:start w:val="1"/>
+      <w:numFmt w:val="bullet"/>
+      <w:lvlText w:val="o"/>
+      <w:lvlJc w:val="left"/>
+      <w:pPr>
+        <w:ind w:left="5760" w:hanging="360"/>
+      </w:pPr>
+      <w:rPr>
+        <w:rFonts w:ascii="Courier New" w:hAnsi="Courier New" w:cs="Courier New" w:hint="default"/>
+      </w:rPr>
+    </w:lvl>
+    <w:lvl w:ilvl="8" w:tplc="04090005" w:tentative="1">
+      <w:start w:val="1"/>
+      <w:numFmt w:val="bullet"/>
+      <w:lvlText w:val=""/>
+      <w:lvlJc w:val="left"/>
+      <w:pPr>
+        <w:ind w:left="6480" w:hanging="360"/>
+      </w:pPr>
+      <w:rPr>
+        <w:rFonts w:ascii="Wingdings" w:hAnsi="Wingdings" w:hint="default"/>
+      </w:rPr>
+    </w:lvl>
+  </w:abstractNum>
   <w:num w:numId="1" w16cid:durableId="2041198646">
+    <w:abstractNumId w:val="5"/>
+  </w:num>
+  <w:num w:numId="2" w16cid:durableId="1407650709">
+    <w:abstractNumId w:val="9"/>
+  </w:num>
+  <w:num w:numId="3" w16cid:durableId="873998711">
     <w:abstractNumId w:val="0"/>
+  </w:num>
+  <w:num w:numId="4" w16cid:durableId="188181436">
+    <w:abstractNumId w:val="8"/>
+  </w:num>
+  <w:num w:numId="5" w16cid:durableId="1263489440">
+    <w:abstractNumId w:val="4"/>
+  </w:num>
+  <w:num w:numId="6" w16cid:durableId="747923918">
+    <w:abstractNumId w:val="7"/>
+  </w:num>
+  <w:num w:numId="7" w16cid:durableId="1172836163">
+    <w:abstractNumId w:val="3"/>
+  </w:num>
+  <w:num w:numId="8" w16cid:durableId="1905218358">
+    <w:abstractNumId w:val="2"/>
+  </w:num>
+  <w:num w:numId="9" w16cid:durableId="838931874">
+    <w:abstractNumId w:val="1"/>
+  </w:num>
+  <w:num w:numId="10" w16cid:durableId="2077820889">
+    <w:abstractNumId w:val="6"/>
   </w:num>
 </w:numbering>
 </file>
@@ -1418,6 +2783,24 @@
       <w:spacing w:val="5"/>
     </w:rPr>
   </w:style>
+  <w:style w:type="paragraph" w:styleId="NormalWeb">
+    <w:name w:val="Normal (Web)"/>
+    <w:basedOn w:val="Normal"/>
+    <w:uiPriority w:val="99"/>
+    <w:semiHidden/>
+    <w:unhideWhenUsed/>
+    <w:rsid w:val="00A634B7"/>
+    <w:pPr>
+      <w:spacing w:before="100" w:beforeAutospacing="1" w:after="100" w:afterAutospacing="1" w:line="240" w:lineRule="auto"/>
+    </w:pPr>
+    <w:rPr>
+      <w:rFonts w:ascii="Times New Roman" w:eastAsia="Times New Roman" w:hAnsi="Times New Roman" w:cs="Times New Roman"/>
+      <w:kern w:val="0"/>
+      <w:sz w:val="24"/>
+      <w:szCs w:val="24"/>
+      <w14:ligatures w14:val="none"/>
+    </w:rPr>
+  </w:style>
 </w:styles>
 </file>
 

</xml_diff>